<commit_message>
Update contract generation and print workflow
</commit_message>
<xml_diff>
--- a/toolprint/MAU_HDLD_TEMPLATE.docx
+++ b/toolprint/MAU_HDLD_TEMPLATE.docx
@@ -229,7 +229,38 @@
           <w:bCs/>
         </w:rPr>
         <w:tab/>
-        <w:t xml:space="preserve">: ÔNG PHẠM QUÝ TRỌNG               Chức vụ: Giám đốc    </w:t>
+      </w:r>
+      <w:r>
+        <w:rPr>
+          <w:bCs/>
+        </w:rPr>
+        <w:t xml:space="preserve">: </w:t>
+      </w:r>
+      <w:r>
+        <w:rPr>
+          <w:b/>
+        </w:rPr>
+        <w:t>ÔNG</w:t>
+      </w:r>
+      <w:r>
+        <w:rPr>
+          <w:b/>
+          <w:bCs/>
+        </w:rPr>
+        <w:t xml:space="preserve"> PHẠM QUÝ TRỌNG               </w:t>
+      </w:r>
+      <w:r>
+        <w:rPr>
+          <w:bCs/>
+        </w:rPr>
+        <w:t>Chức vụ:</w:t>
+      </w:r>
+      <w:r>
+        <w:rPr>
+          <w:b/>
+          <w:bCs/>
+        </w:rPr>
+        <w:t xml:space="preserve"> Giám đốc    </w:t>
       </w:r>
     </w:p>
     <w:p>
@@ -249,7 +280,19 @@
         <w:tab/>
       </w:r>
       <w:r>
-        <w:t>: Lô L23-34 Khu đô thị An Bình Tân, Phường Nam Nha Trang, Tỉnh Khánh Hòa.</w:t>
+        <w:t xml:space="preserve">: </w:t>
+      </w:r>
+      <w:r>
+        <w:rPr>
+          <w:highlight w:val="yellow"/>
+        </w:rPr>
+        <w:t>..</w:t>
+      </w:r>
+      <w:r>
+        <w:rPr>
+          <w:highlight w:val="yellow"/>
+        </w:rPr>
+        <w:t>........................................................................................................................</w:t>
       </w:r>
     </w:p>
     <w:p>
@@ -435,20 +478,32 @@
       <w:r>
         <w:rPr>
           <w:highlight w:val="yellow"/>
-        </w:rPr>
-        <w:t>CCCD số</w:t>
+          <w:lang w:val="en-US"/>
+        </w:rPr>
+        <w:t>S</w:t>
       </w:r>
       <w:r>
         <w:rPr>
           <w:highlight w:val="yellow"/>
         </w:rPr>
+        <w:t xml:space="preserve">ố CCCD </w:t>
+      </w:r>
+      <w:r>
+        <w:rPr>
+          <w:highlight w:val="yellow"/>
+        </w:rPr>
         <w:tab/>
       </w:r>
       <w:r>
         <w:rPr>
           <w:highlight w:val="yellow"/>
         </w:rPr>
-        <w:tab/>
+        <w:t xml:space="preserve">            </w:t>
+      </w:r>
+      <w:r>
+        <w:rPr>
+          <w:highlight w:val="yellow"/>
+        </w:rPr>
         <w:t>: {{CCCD}}</w:t>
       </w:r>
       <w:r>
@@ -492,22 +547,43 @@
         <w:tab/>
         <w:t>: {{NCAP}}</w:t>
       </w:r>
+      <w:r>
+        <w:rPr>
+          <w:highlight w:val="yellow"/>
+        </w:rPr>
+        <w:tab/>
+      </w:r>
     </w:p>
     <w:p>
       <w:pPr>
         <w:spacing w:after="80" w:line="276" w:lineRule="auto"/>
         <w:jc w:val="both"/>
-      </w:pPr>
-      <w:r>
         <w:rPr>
           <w:highlight w:val="yellow"/>
         </w:rPr>
-        <w:t>Mã số thuế</w:t>
-      </w:r>
+      </w:pPr>
       <w:r>
         <w:rPr>
           <w:highlight w:val="yellow"/>
         </w:rPr>
+        <w:t>S</w:t>
+      </w:r>
+      <w:r>
+        <w:rPr>
+          <w:highlight w:val="yellow"/>
+        </w:rPr>
+        <w:t>ố</w:t>
+      </w:r>
+      <w:r>
+        <w:rPr>
+          <w:highlight w:val="yellow"/>
+        </w:rPr>
+        <w:t xml:space="preserve"> điện thoại</w:t>
+      </w:r>
+      <w:r>
+        <w:rPr>
+          <w:highlight w:val="yellow"/>
+        </w:rPr>
         <w:tab/>
       </w:r>
       <w:r>
@@ -515,14 +591,7 @@
           <w:highlight w:val="yellow"/>
         </w:rPr>
         <w:tab/>
-        <w:t xml:space="preserve">: {{MST}}  </w:t>
-      </w:r>
-      <w:r>
-        <w:rPr>
-          <w:highlight w:val="yellow"/>
-        </w:rPr>
-        <w:tab/>
-        <w:t>Điện thoại: {{SDT}}</w:t>
+        <w:t>: ....................</w:t>
       </w:r>
     </w:p>
     <w:p>
@@ -1718,12 +1787,12 @@
           <w:ilvl w:val="0"/>
           <w:numId w:val="26"/>
         </w:numPr>
-        <w:spacing w:after="240" w:line="276" w:lineRule="auto"/>
-        <w:ind w:left="547" w:hanging="547"/>
-        <w:jc w:val="both"/>
-      </w:pPr>
-      <w:r>
-        <w:t>Hợp đồng lập thành 02 bản có giá trị như nhau, mỗi bên giữ 01 bản, có hiệu lực kể từ ngày ký.</w:t>
+        <w:spacing w:after="80" w:line="276" w:lineRule="auto"/>
+        <w:ind w:left="540" w:hanging="540"/>
+        <w:jc w:val="both"/>
+      </w:pPr>
+      <w:r>
+        <w:t>Hợp đồng lập thành 03 bản có giá trị như nhau, Công ty giữ 02 bản, Người lao động giữ 01 bản, có hiệu lực kể từ ngày ký.</w:t>
       </w:r>
     </w:p>
     <w:tbl>
@@ -1761,6 +1830,10 @@
             <w:pPr>
               <w:spacing w:after="60" w:line="276" w:lineRule="auto"/>
               <w:jc w:val="center"/>
+              <w:rPr>
+                <w:i/>
+                <w:iCs/>
+              </w:rPr>
             </w:pPr>
             <w:r>
               <w:rPr>
@@ -1769,6 +1842,102 @@
               </w:rPr>
               <w:t>(Ký, ghi rõ họ tên)</w:t>
             </w:r>
+          </w:p>
+          <w:p>
+            <w:pPr>
+              <w:spacing w:after="60" w:line="276" w:lineRule="auto"/>
+              <w:jc w:val="center"/>
+              <w:rPr>
+                <w:i/>
+                <w:iCs/>
+              </w:rPr>
+            </w:pPr>
+          </w:p>
+          <w:p>
+            <w:pPr>
+              <w:spacing w:after="60" w:line="276" w:lineRule="auto"/>
+              <w:jc w:val="center"/>
+              <w:rPr>
+                <w:i/>
+                <w:iCs/>
+              </w:rPr>
+            </w:pPr>
+          </w:p>
+          <w:p>
+            <w:pPr>
+              <w:spacing w:after="60" w:line="276" w:lineRule="auto"/>
+              <w:jc w:val="center"/>
+              <w:rPr>
+                <w:i/>
+                <w:iCs/>
+              </w:rPr>
+            </w:pPr>
+          </w:p>
+          <w:p>
+            <w:pPr>
+              <w:spacing w:after="60" w:line="276" w:lineRule="auto"/>
+              <w:jc w:val="center"/>
+              <w:rPr>
+                <w:i/>
+                <w:iCs/>
+              </w:rPr>
+            </w:pPr>
+          </w:p>
+          <w:p>
+            <w:pPr>
+              <w:spacing w:after="60" w:line="276" w:lineRule="auto"/>
+              <w:jc w:val="center"/>
+              <w:rPr>
+                <w:i/>
+                <w:iCs/>
+                <w:lang w:val="en-AU"/>
+              </w:rPr>
+            </w:pPr>
+            <w:r>
+              <w:rPr>
+                <w:i/>
+                <w:iCs/>
+                <w:highlight w:val="yellow"/>
+                <w:lang w:val="en-AU"/>
+              </w:rPr>
+              <w:t>............................</w:t>
+            </w:r>
+          </w:p>
+          <w:p>
+            <w:pPr>
+              <w:spacing w:after="60" w:line="276" w:lineRule="auto"/>
+              <w:jc w:val="center"/>
+              <w:rPr>
+                <w:i/>
+                <w:iCs/>
+              </w:rPr>
+            </w:pPr>
+          </w:p>
+          <w:p>
+            <w:pPr>
+              <w:spacing w:after="60" w:line="276" w:lineRule="auto"/>
+              <w:jc w:val="center"/>
+              <w:rPr>
+                <w:i/>
+                <w:iCs/>
+              </w:rPr>
+            </w:pPr>
+          </w:p>
+          <w:p>
+            <w:pPr>
+              <w:spacing w:after="60" w:line="276" w:lineRule="auto"/>
+              <w:jc w:val="center"/>
+              <w:rPr>
+                <w:i/>
+                <w:iCs/>
+              </w:rPr>
+            </w:pPr>
+          </w:p>
+          <w:p>
+            <w:pPr>
+              <w:spacing w:after="60" w:line="276" w:lineRule="auto"/>
+              <w:jc w:val="center"/>
+            </w:pPr>
           </w:p>
         </w:tc>
         <w:tc>
@@ -1875,11 +2044,6 @@
         </w:tc>
       </w:tr>
     </w:tbl>
-    <w:p>
-      <w:pPr>
-        <w:spacing w:line="276" w:lineRule="auto"/>
-      </w:pPr>
-    </w:p>
     <w:p/>
     <w:sectPr>
       <w:footerReference w:type="default" r:id="rId8"/>

</xml_diff>